<commit_message>
Update SEO summary doc — add /faq page and services editorial pass
https://claude.ai/code/session_019ahptADHxAZPjkn1dNj4X2
</commit_message>
<xml_diff>
--- a/reevesestates-seo-summary-april-2026.docx
+++ b/reevesestates-seo-summary-april-2026.docx
@@ -3,14 +3,11 @@
 <w:document xmlns:wpc="http://schemas.microsoft.com/office/word/2010/wordprocessingCanvas" xmlns:mo="http://schemas.microsoft.com/office/mac/office/2008/main" xmlns:mc="http://schemas.openxmlformats.org/markup-compatibility/2006" xmlns:mv="urn:schemas-microsoft-com:mac:vml" xmlns:o="urn:schemas-microsoft-com:office:office" xmlns:r="http://schemas.openxmlformats.org/officeDocument/2006/relationships" xmlns:m="http://schemas.openxmlformats.org/officeDocument/2006/math" xmlns:v="urn:schemas-microsoft-com:vml" xmlns:wp14="http://schemas.microsoft.com/office/word/2010/wordprocessingDrawing" xmlns:wp="http://schemas.openxmlformats.org/drawingml/2006/wordprocessingDrawing" xmlns:w10="urn:schemas-microsoft-com:office:word" xmlns:w="http://schemas.openxmlformats.org/wordprocessingml/2006/main" xmlns:w14="http://schemas.microsoft.com/office/word/2010/wordml" xmlns:wpg="http://schemas.microsoft.com/office/word/2010/wordprocessingGroup" xmlns:wpi="http://schemas.microsoft.com/office/word/2010/wordprocessingInk" xmlns:wne="http://schemas.microsoft.com/office/word/2006/wordml" xmlns:wps="http://schemas.microsoft.com/office/word/2010/wordprocessingShape" mc:Ignorable="w14 wp14">
   <w:body>
     <w:p>
-      <w:pPr>
-        <w:jc w:val="left"/>
-      </w:pPr>
       <w:r>
         <w:rPr>
           <w:b/>
           <w:color w:val="1C1C1C"/>
-          <w:sz w:val="48"/>
+          <w:sz w:val="44"/>
         </w:rPr>
         <w:t>reevesestates.com — Development Summary</w:t>
       </w:r>
@@ -28,7 +25,7 @@
     <w:p/>
     <w:p>
       <w:pPr>
-        <w:jc w:val="left"/>
+        <w:spacing w:before="120" w:after="40"/>
       </w:pPr>
       <w:r>
         <w:rPr>
@@ -41,76 +38,75 @@
     </w:p>
     <w:p>
       <w:pPr>
-        <w:spacing w:before="80" w:after="80"/>
+        <w:spacing w:before="40" w:after="80"/>
       </w:pPr>
       <w:r>
         <w:rPr>
-          <w:color w:val="CCCCCC"/>
-          <w:sz w:val="16"/>
+          <w:color w:val="DDDDDD"/>
+          <w:sz w:val="14"/>
         </w:rPr>
-        <w:t>────────────────────────────────────────────────────────────</w:t>
+        <w:t>────────────────────────────────────────────────────────────────────────</w:t>
       </w:r>
     </w:p>
-    <w:p/>
     <w:p>
       <w:pPr>
-        <w:jc w:val="left"/>
+        <w:spacing w:before="200" w:after="40"/>
       </w:pPr>
       <w:r>
         <w:rPr>
           <w:b/>
           <w:color w:val="B8956A"/>
-          <w:sz w:val="28"/>
+          <w:sz w:val="26"/>
         </w:rPr>
         <w:t>SEO Phase 1 — Merged 10 April</w:t>
       </w:r>
     </w:p>
-    <w:p/>
     <w:p>
       <w:pPr>
-        <w:jc w:val="left"/>
+        <w:spacing w:before="120" w:after="40"/>
       </w:pPr>
       <w:r>
         <w:rPr>
           <w:b/>
           <w:color w:val="1C1C1C"/>
-          <w:sz w:val="24"/>
+          <w:sz w:val="22"/>
         </w:rPr>
-        <w:t>Services Page  (/services)</w:t>
+        <w:t>Services page  (/services)</w:t>
       </w:r>
     </w:p>
     <w:p>
       <w:pPr>
-        <w:spacing w:after="120"/>
+        <w:spacing w:after="80"/>
       </w:pPr>
       <w:r>
         <w:rPr>
+          <w:i w:val="0"/>
           <w:color w:val="666666"/>
           <w:sz w:val="22"/>
         </w:rPr>
         <w:t>A dedicated, fully SEO-optimised /services page was built covering all ten service categories: estate sales, cash buyout, estate appraisal, fine art &amp; antiques, private treaty sales, executor support, estate clearance, on-site sales, living estates, and partial estates. Each service carries its own copy, target keywords, and internal anchor. The page includes a canonical URL and full OpenGraph metadata.</w:t>
       </w:r>
     </w:p>
-    <w:p/>
     <w:p>
       <w:pPr>
-        <w:jc w:val="left"/>
+        <w:spacing w:before="120" w:after="40"/>
       </w:pPr>
       <w:r>
         <w:rPr>
           <w:b/>
           <w:color w:val="1C1C1C"/>
-          <w:sz w:val="24"/>
+          <w:sz w:val="22"/>
         </w:rPr>
-        <w:t>Neighbourhood Pages  (×8)</w:t>
+        <w:t>Neighbourhood pages  (×8)</w:t>
       </w:r>
     </w:p>
     <w:p>
       <w:pPr>
-        <w:spacing w:after="120"/>
+        <w:spacing w:after="80"/>
       </w:pPr>
       <w:r>
         <w:rPr>
+          <w:i w:val="0"/>
           <w:color w:val="666666"/>
           <w:sz w:val="22"/>
         </w:rPr>
@@ -120,6 +116,7 @@
     <w:p>
       <w:pPr>
         <w:pStyle w:val="ListBullet"/>
+        <w:spacing w:after="40"/>
       </w:pPr>
       <w:r>
         <w:rPr>
@@ -132,6 +129,7 @@
     <w:p>
       <w:pPr>
         <w:pStyle w:val="ListBullet"/>
+        <w:spacing w:after="40"/>
       </w:pPr>
       <w:r>
         <w:rPr>
@@ -144,6 +142,7 @@
     <w:p>
       <w:pPr>
         <w:pStyle w:val="ListBullet"/>
+        <w:spacing w:after="40"/>
       </w:pPr>
       <w:r>
         <w:rPr>
@@ -156,6 +155,7 @@
     <w:p>
       <w:pPr>
         <w:pStyle w:val="ListBullet"/>
+        <w:spacing w:after="40"/>
       </w:pPr>
       <w:r>
         <w:rPr>
@@ -168,6 +168,7 @@
     <w:p>
       <w:pPr>
         <w:pStyle w:val="ListBullet"/>
+        <w:spacing w:after="40"/>
       </w:pPr>
       <w:r>
         <w:rPr>
@@ -180,6 +181,7 @@
     <w:p>
       <w:pPr>
         <w:pStyle w:val="ListBullet"/>
+        <w:spacing w:after="40"/>
       </w:pPr>
       <w:r>
         <w:rPr>
@@ -192,6 +194,7 @@
     <w:p>
       <w:pPr>
         <w:pStyle w:val="ListBullet"/>
+        <w:spacing w:after="40"/>
       </w:pPr>
       <w:r>
         <w:rPr>
@@ -204,6 +207,7 @@
     <w:p>
       <w:pPr>
         <w:pStyle w:val="ListBullet"/>
+        <w:spacing w:after="40"/>
       </w:pPr>
       <w:r>
         <w:rPr>
@@ -215,36 +219,37 @@
     </w:p>
     <w:p>
       <w:pPr>
-        <w:spacing w:after="120"/>
+        <w:spacing w:after="80"/>
       </w:pPr>
       <w:r>
         <w:rPr>
+          <w:i w:val="0"/>
           <w:color w:val="666666"/>
           <w:sz w:val="22"/>
         </w:rPr>
-        <w:t>Each page includes a targeted H1, two to four H2 sections with locally relevant copy, a nearby-neighbourhoods internal linking block, and a contact CTA. All eight pages carry canonical URLs and OpenGraph tags. H1 headings were refined in a follow-up polish pass (also 10 April).</w:t>
+        <w:t>Each page includes a targeted H1, two to four H2 sections with locally relevant copy, a nearby-neighbourhoods internal linking block, and a contact CTA. All eight carry canonical URLs and OpenGraph tags. H1 headings were refined in a follow-up polish pass (also 10 April).</w:t>
       </w:r>
     </w:p>
-    <w:p/>
     <w:p>
       <w:pPr>
-        <w:jc w:val="left"/>
+        <w:spacing w:before="120" w:after="40"/>
       </w:pPr>
       <w:r>
         <w:rPr>
           <w:b/>
           <w:color w:val="1C1C1C"/>
-          <w:sz w:val="24"/>
+          <w:sz w:val="22"/>
         </w:rPr>
-        <w:t>Technical SEO Foundation</w:t>
+        <w:t>Technical SEO foundation</w:t>
       </w:r>
     </w:p>
     <w:p>
       <w:pPr>
-        <w:spacing w:after="120"/>
+        <w:spacing w:after="80"/>
       </w:pPr>
       <w:r>
         <w:rPr>
+          <w:i w:val="0"/>
           <w:color w:val="666666"/>
           <w:sz w:val="22"/>
         </w:rPr>
@@ -254,6 +259,7 @@
     <w:p>
       <w:pPr>
         <w:pStyle w:val="ListBullet"/>
+        <w:spacing w:after="40"/>
       </w:pPr>
       <w:r>
         <w:rPr>
@@ -266,6 +272,7 @@
     <w:p>
       <w:pPr>
         <w:pStyle w:val="ListBullet"/>
+        <w:spacing w:after="40"/>
       </w:pPr>
       <w:r>
         <w:rPr>
@@ -278,6 +285,7 @@
     <w:p>
       <w:pPr>
         <w:pStyle w:val="ListBullet"/>
+        <w:spacing w:after="40"/>
       </w:pPr>
       <w:r>
         <w:rPr>
@@ -290,6 +298,7 @@
     <w:p>
       <w:pPr>
         <w:pStyle w:val="ListBullet"/>
+        <w:spacing w:after="40"/>
       </w:pPr>
       <w:r>
         <w:rPr>
@@ -302,6 +311,7 @@
     <w:p>
       <w:pPr>
         <w:pStyle w:val="ListBullet"/>
+        <w:spacing w:after="40"/>
       </w:pPr>
       <w:r>
         <w:rPr>
@@ -314,6 +324,7 @@
     <w:p>
       <w:pPr>
         <w:pStyle w:val="ListBullet"/>
+        <w:spacing w:after="40"/>
       </w:pPr>
       <w:r>
         <w:rPr>
@@ -326,6 +337,7 @@
     <w:p>
       <w:pPr>
         <w:pStyle w:val="ListBullet"/>
+        <w:spacing w:after="40"/>
       </w:pPr>
       <w:r>
         <w:rPr>
@@ -338,6 +350,7 @@
     <w:p>
       <w:pPr>
         <w:pStyle w:val="ListBullet"/>
+        <w:spacing w:after="40"/>
       </w:pPr>
       <w:r>
         <w:rPr>
@@ -347,77 +360,322 @@
         <w:t>Verified Google Business Profile Place ID wired to the Get Directions link</w:t>
       </w:r>
     </w:p>
-    <w:p/>
     <w:p>
       <w:pPr>
-        <w:jc w:val="left"/>
+        <w:spacing w:before="120" w:after="40"/>
       </w:pPr>
       <w:r>
         <w:rPr>
           <w:b/>
           <w:color w:val="1C1C1C"/>
-          <w:sz w:val="24"/>
+          <w:sz w:val="22"/>
         </w:rPr>
-        <w:t>Design &amp; Typography</w:t>
+        <w:t>Design &amp; typography</w:t>
       </w:r>
     </w:p>
     <w:p>
       <w:pPr>
-        <w:spacing w:after="120"/>
+        <w:spacing w:after="80"/>
+      </w:pPr>
+      <w:r>
+        <w:rPr>
+          <w:i w:val="0"/>
+          <w:color w:val="666666"/>
+          <w:sz w:val="22"/>
+        </w:rPr>
+        <w:t>The full font system was overhauled: PP Hatton Medium (H1), PP Pangram Sans Compact (UI/labels), and PP Fragment Glare (body) replaced all legacy fonts site-wide. Navigation was refined — phone number prominence increased, baseline alignment corrected, bronze border treatment added on desktop.</w:t>
+      </w:r>
+    </w:p>
+    <w:p>
+      <w:pPr>
+        <w:spacing w:before="200" w:after="40"/>
+      </w:pPr>
+      <w:r>
+        <w:rPr>
+          <w:b/>
+          <w:color w:val="B8956A"/>
+          <w:sz w:val="26"/>
+        </w:rPr>
+        <w:t>This Week — 17 April</w:t>
+      </w:r>
+    </w:p>
+    <w:p>
+      <w:pPr>
+        <w:spacing w:before="120" w:after="40"/>
+      </w:pPr>
+      <w:r>
+        <w:rPr>
+          <w:b/>
+          <w:color w:val="1C1C1C"/>
+          <w:sz w:val="22"/>
+        </w:rPr>
+        <w:t>FAQ heading fix</w:t>
+      </w:r>
+    </w:p>
+    <w:p>
+      <w:pPr>
+        <w:spacing w:after="80"/>
+      </w:pPr>
+      <w:r>
+        <w:rPr>
+          <w:i w:val="0"/>
+          <w:color w:val="666666"/>
+          <w:sz w:val="22"/>
+        </w:rPr>
+        <w:t>The FAQ section heading was hidden behind the fixed navigation bar when users arrived via an anchor link (/#faq). Fixed by adding scroll-mt-20 to the section element. Merged directly to main and deployed.</w:t>
+      </w:r>
+    </w:p>
+    <w:p>
+      <w:pPr>
+        <w:spacing w:before="120" w:after="40"/>
+      </w:pPr>
+      <w:r>
+        <w:rPr>
+          <w:b/>
+          <w:color w:val="1C1C1C"/>
+          <w:sz w:val="22"/>
+        </w:rPr>
+        <w:t>Standalone /faq page  (feature/faq-page — in preview)</w:t>
+      </w:r>
+    </w:p>
+    <w:p>
+      <w:pPr>
+        <w:spacing w:after="80"/>
+      </w:pPr>
+      <w:r>
+        <w:rPr>
+          <w:i w:val="0"/>
+          <w:color w:val="666666"/>
+          <w:sz w:val="22"/>
+        </w:rPr>
+        <w:t>The FAQ was promoted from a homepage section to a fully indexed standalone route at /faq. Changes:</w:t>
+      </w:r>
+    </w:p>
+    <w:p>
+      <w:pPr>
+        <w:pStyle w:val="ListBullet"/>
+        <w:spacing w:after="40"/>
       </w:pPr>
       <w:r>
         <w:rPr>
           <w:color w:val="666666"/>
           <w:sz w:val="22"/>
         </w:rPr>
-        <w:t>The full font system was overhauled: PP Hatton Medium (H1), PP Pangram Sans Compact (UI/labels), and PP Fragment Glare (body) replaced all legacy fonts site-wide. Navigation was refined — phone number prominence increased, baseline alignment corrected, and a bronze border treatment added on desktop.</w:t>
-      </w:r>
-    </w:p>
-    <w:p/>
-    <w:p>
-      <w:pPr>
-        <w:jc w:val="left"/>
-      </w:pPr>
-      <w:r>
-        <w:rPr>
-          <w:b/>
-          <w:color w:val="B8956A"/>
-          <w:sz w:val="28"/>
-        </w:rPr>
-        <w:t>This Week — 17 April</w:t>
-      </w:r>
-    </w:p>
-    <w:p/>
-    <w:p>
-      <w:pPr>
-        <w:jc w:val="left"/>
-      </w:pPr>
-      <w:r>
-        <w:rPr>
-          <w:b/>
-          <w:color w:val="1C1C1C"/>
-          <w:sz w:val="24"/>
-        </w:rPr>
-        <w:t>FAQ Heading Fix</w:t>
+        <w:t>New /faq route inheriting the (content) layout (Navigation + Footer + pt-20)</w:t>
       </w:r>
     </w:p>
     <w:p>
       <w:pPr>
-        <w:spacing w:after="120"/>
+        <w:pStyle w:val="ListBullet"/>
+        <w:spacing w:after="40"/>
       </w:pPr>
       <w:r>
         <w:rPr>
           <w:color w:val="666666"/>
           <w:sz w:val="22"/>
         </w:rPr>
-        <w:t>The FAQ section heading was hidden behind the fixed navigation bar when users arrived via an anchor link (/#faq). Fixed by adding scroll-mt-20 to the section element, pushing the heading clear of the nav on both desktop and mobile. Merged directly to main and deployed.</w:t>
+        <w:t>H1 in the charcoal header: "Your Estate Sale Questions, Answered"</w:t>
+      </w:r>
+    </w:p>
+    <w:p>
+      <w:pPr>
+        <w:pStyle w:val="ListBullet"/>
+        <w:spacing w:after="40"/>
+      </w:pPr>
+      <w:r>
+        <w:rPr>
+          <w:color w:val="666666"/>
+          <w:sz w:val="22"/>
+        </w:rPr>
+        <w:t>Full FAQPage JSON-LD schema covering all 14 questions across 5 groups — the homepage schema only covered 5</w:t>
+      </w:r>
+    </w:p>
+    <w:p>
+      <w:pPr>
+        <w:pStyle w:val="ListBullet"/>
+        <w:spacing w:after="40"/>
+      </w:pPr>
+      <w:r>
+        <w:rPr>
+          <w:color w:val="666666"/>
+          <w:sz w:val="22"/>
+        </w:rPr>
+        <w:t>Targeted metadata: title, meta description, canonical URL, OpenGraph tags</w:t>
+      </w:r>
+    </w:p>
+    <w:p>
+      <w:pPr>
+        <w:pStyle w:val="ListBullet"/>
+        <w:spacing w:after="40"/>
+      </w:pPr>
+      <w:r>
+        <w:rPr>
+          <w:color w:val="666666"/>
+          <w:sz w:val="22"/>
+        </w:rPr>
+        <w:t>Internal linking block to /services and all 8 neighbourhood pages</w:t>
+      </w:r>
+    </w:p>
+    <w:p>
+      <w:pPr>
+        <w:pStyle w:val="ListBullet"/>
+        <w:spacing w:after="40"/>
+      </w:pPr>
+      <w:r>
+        <w:rPr>
+          <w:color w:val="666666"/>
+          <w:sz w:val="22"/>
+        </w:rPr>
+        <w:t>FAQ data extracted to src/lib/faq-data.ts (plain module, no directives) so both the server page and client accordion can import it — resolves a Next.js server/client boundary error</w:t>
+      </w:r>
+    </w:p>
+    <w:p>
+      <w:pPr>
+        <w:pStyle w:val="ListBullet"/>
+        <w:spacing w:after="40"/>
+      </w:pPr>
+      <w:r>
+        <w:rPr>
+          <w:color w:val="666666"/>
+          <w:sz w:val="22"/>
+        </w:rPr>
+        <w:t>Navigation updated: FAQs link now points to /faq rather than /#faq</w:t>
+      </w:r>
+    </w:p>
+    <w:p>
+      <w:pPr>
+        <w:pStyle w:val="ListBullet"/>
+        <w:spacing w:after="40"/>
+      </w:pPr>
+      <w:r>
+        <w:rPr>
+          <w:color w:val="666666"/>
+          <w:sz w:val="22"/>
+        </w:rPr>
+        <w:t>Sitemap updated: /#faq anchor entry replaced with /faq at priority 0.8</w:t>
+      </w:r>
+    </w:p>
+    <w:p>
+      <w:pPr>
+        <w:spacing w:before="120" w:after="40"/>
+      </w:pPr>
+      <w:r>
+        <w:rPr>
+          <w:b/>
+          <w:color w:val="1C1C1C"/>
+          <w:sz w:val="22"/>
+        </w:rPr>
+        <w:t>Services page editorial pass  (feature/faq-page — in preview)</w:t>
+      </w:r>
+    </w:p>
+    <w:p>
+      <w:pPr>
+        <w:spacing w:after="80"/>
+      </w:pPr>
+      <w:r>
+        <w:rPr>
+          <w:i w:val="0"/>
+          <w:color w:val="666666"/>
+          <w:sz w:val="22"/>
+        </w:rPr>
+        <w:t>A targeted copy and presentation pass on /services, addressing SEO template patterns that had crept into the page:</w:t>
+      </w:r>
+    </w:p>
+    <w:p>
+      <w:pPr>
+        <w:pStyle w:val="ListBullet"/>
+        <w:spacing w:after="40"/>
+      </w:pPr>
+      <w:r>
+        <w:rPr>
+          <w:color w:val="666666"/>
+          <w:sz w:val="22"/>
+        </w:rPr>
+        <w:t>Eyebrow labels: the page was rendering service.keywords[0] as visible UI text, printing raw keyword phrases ("Houston estate sales", "estate buyout Houston") as design elements. Replaced with ten editorial context labels — "The complete engagement", "Immediate resolution", "Before any decision", etc.</w:t>
+      </w:r>
+    </w:p>
+    <w:p>
+      <w:pPr>
+        <w:pStyle w:val="ListBullet"/>
+        <w:spacing w:after="40"/>
+      </w:pPr>
+      <w:r>
+        <w:rPr>
+          <w:color w:val="666666"/>
+          <w:sz w:val="22"/>
+        </w:rPr>
+        <w:t>Repeated phrases: "for whatever comes next" appeared in both Cash Buyout and Estate Clearance; "works especially well" appeared twice. Both patterns broken.</w:t>
+      </w:r>
+    </w:p>
+    <w:p>
+      <w:pPr>
+        <w:pStyle w:val="ListBullet"/>
+        <w:spacing w:after="40"/>
+      </w:pPr>
+      <w:r>
+        <w:rPr>
+          <w:color w:val="666666"/>
+          <w:sz w:val="22"/>
+        </w:rPr>
+        <w:t>Estate Sales: dry procedural closer rewritten — "At the close, you receive a full accounting — every item, every dollar."</w:t>
+      </w:r>
+    </w:p>
+    <w:p>
+      <w:pPr>
+        <w:pStyle w:val="ListBullet"/>
+        <w:spacing w:after="40"/>
+      </w:pPr>
+      <w:r>
+        <w:rPr>
+          <w:color w:val="666666"/>
+          <w:sz w:val="22"/>
+        </w:rPr>
+        <w:t>Fine Art &amp; Antiques: keyword inventory list (paintings, prints, sculpture, silver, porcelain...) replaced with prose; padded closer "before we consider any other channel" removed.</w:t>
+      </w:r>
+    </w:p>
+    <w:p>
+      <w:pPr>
+        <w:pStyle w:val="ListBullet"/>
+        <w:spacing w:after="40"/>
+      </w:pPr>
+      <w:r>
+        <w:rPr>
+          <w:color w:val="666666"/>
+          <w:sz w:val="22"/>
+        </w:rPr>
+        <w:t>Private Treaty Sales: "and beyond" cut; the value/provenance/preference triplet simplified to "When a piece calls for more discretion."</w:t>
+      </w:r>
+    </w:p>
+    <w:p>
+      <w:pPr>
+        <w:pStyle w:val="ListBullet"/>
+        <w:spacing w:after="40"/>
+      </w:pPr>
+      <w:r>
+        <w:rPr>
+          <w:color w:val="666666"/>
+          <w:sz w:val="22"/>
+        </w:rPr>
+        <w:t>Executor Support: "the trusted local partner" cliché replaced — "we're on the ground here."</w:t>
+      </w:r>
+    </w:p>
+    <w:p>
+      <w:pPr>
+        <w:pStyle w:val="ListBullet"/>
+        <w:spacing w:after="40"/>
+      </w:pPr>
+      <w:r>
+        <w:rPr>
+          <w:color w:val="666666"/>
+          <w:sz w:val="22"/>
+        </w:rPr>
+        <w:t>On-Site Sales: two-list paragraph (pricing, staging, marketing, staffing, security / manages the flow of buyers, processes every transaction) replaced with a single prose sentence.</w:t>
       </w:r>
     </w:p>
     <w:p/>
-    <w:p/>
     <w:p>
       <w:pPr>
-        <w:jc w:val="left"/>
+        <w:spacing w:before="120" w:after="40"/>
       </w:pPr>
       <w:r>
         <w:rPr>
@@ -430,47 +688,45 @@
     </w:p>
     <w:p>
       <w:pPr>
-        <w:spacing w:before="80" w:after="80"/>
+        <w:spacing w:before="40" w:after="80"/>
       </w:pPr>
       <w:r>
         <w:rPr>
-          <w:color w:val="CCCCCC"/>
-          <w:sz w:val="16"/>
+          <w:color w:val="DDDDDD"/>
+          <w:sz w:val="14"/>
         </w:rPr>
-        <w:t>────────────────────────────────────────────────────────────</w:t>
+        <w:t>────────────────────────────────────────────────────────────────────────</w:t>
       </w:r>
     </w:p>
-    <w:p/>
     <w:p>
       <w:pPr>
-        <w:spacing w:after="120"/>
+        <w:spacing w:after="80"/>
       </w:pPr>
       <w:r>
         <w:rPr>
+          <w:i w:val="0"/>
           <w:color w:val="666666"/>
           <w:sz w:val="22"/>
         </w:rPr>
-        <w:t>Phase 1 built the content infrastructure: a services page and eight neighbourhood pages. The natural next step is a standalone FAQ page at /faq.</w:t>
+        <w:t>Phase 1 built the content infrastructure: a services page and eight neighbourhood pages. The natural next step — now complete in preview — is a standalone FAQ page at /faq. The rationale and execution plan are documented below for reference.</w:t>
       </w:r>
     </w:p>
-    <w:p/>
     <w:p>
       <w:pPr>
-        <w:jc w:val="left"/>
+        <w:spacing w:before="200" w:after="40"/>
       </w:pPr>
       <w:r>
         <w:rPr>
           <w:b/>
           <w:color w:val="B8956A"/>
-          <w:sz w:val="28"/>
+          <w:sz w:val="26"/>
         </w:rPr>
         <w:t>Why this is the right next move</w:t>
       </w:r>
     </w:p>
-    <w:p/>
     <w:p>
       <w:pPr>
-        <w:spacing w:after="160"/>
+        <w:spacing w:after="120"/>
       </w:pPr>
       <w:r>
         <w:rPr>
@@ -490,7 +746,7 @@
     </w:p>
     <w:p>
       <w:pPr>
-        <w:spacing w:after="160"/>
+        <w:spacing w:after="120"/>
       </w:pPr>
       <w:r>
         <w:rPr>
@@ -505,12 +761,12 @@
           <w:color w:val="666666"/>
           <w:sz w:val="22"/>
         </w:rPr>
-        <w:t>Google frequently surfaces FAQ-structured content in PAA boxes, which appear prominently above organic results for question-based queries. FAQPage schema (already proven on the homepage) applied to a full dedicated page dramatically increases the chance of capturing those positions.</w:t>
+        <w:t>Google frequently surfaces FAQ-structured content in PAA boxes, which appear prominently above organic results for question-based queries. FAQPage schema applied to a full dedicated page dramatically increases the chance of capturing those positions.</w:t>
       </w:r>
     </w:p>
     <w:p>
       <w:pPr>
-        <w:spacing w:after="160"/>
+        <w:spacing w:after="120"/>
       </w:pPr>
       <w:r>
         <w:rPr>
@@ -525,12 +781,12 @@
           <w:color w:val="666666"/>
           <w:sz w:val="22"/>
         </w:rPr>
-        <w:t>A /faq page provides natural linking opportunities to and from /services and all eight neighbourhood pages, distributing page authority across the site and reinforcing topical relevance.</w:t>
+        <w:t>A /faq page provides natural linking opportunities to and from /services and all eight neighbourhood pages, distributing page authority and reinforcing topical relevance.</w:t>
       </w:r>
     </w:p>
     <w:p>
       <w:pPr>
-        <w:spacing w:after="160"/>
+        <w:spacing w:after="120"/>
       </w:pPr>
       <w:r>
         <w:rPr>
@@ -545,27 +801,25 @@
           <w:color w:val="666666"/>
           <w:sz w:val="22"/>
         </w:rPr>
-        <w:t>The accordion component and all FAQ content already exist. This is primarily a routing, metadata, and schema task — one focused build session.</w:t>
+        <w:t>The accordion component and all FAQ content already exist. This was primarily a routing, metadata, and schema task — one focused build session.</w:t>
       </w:r>
     </w:p>
-    <w:p/>
     <w:p>
       <w:pPr>
-        <w:jc w:val="left"/>
+        <w:spacing w:before="200" w:after="40"/>
       </w:pPr>
       <w:r>
         <w:rPr>
           <w:b/>
           <w:color w:val="B8956A"/>
-          <w:sz w:val="28"/>
+          <w:sz w:val="26"/>
         </w:rPr>
-        <w:t>Execution Plan</w:t>
+        <w:t>Execution — completed in this session</w:t>
       </w:r>
     </w:p>
-    <w:p/>
     <w:p>
       <w:pPr>
-        <w:spacing w:after="160"/>
+        <w:spacing w:after="120"/>
       </w:pPr>
       <w:r>
         <w:rPr>
@@ -573,19 +827,19 @@
           <w:color w:val="1C1C1C"/>
           <w:sz w:val="22"/>
         </w:rPr>
-        <w:t xml:space="preserve">Step 1: Create the route  </w:t>
+        <w:t xml:space="preserve">Step 1: Route created  </w:t>
       </w:r>
       <w:r>
         <w:rPr>
           <w:color w:val="666666"/>
           <w:sz w:val="22"/>
         </w:rPr>
-        <w:t>Add src/app/(content)/faq/page.tsx. The (content) route group already provides the Navigation + Footer layout with pt-20 main, so the page inherits both automatically.</w:t>
+        <w:t>src/app/(content)/faq/page.tsx — inherits Navigation + Footer from the (content) layout.</w:t>
       </w:r>
     </w:p>
     <w:p>
       <w:pPr>
-        <w:spacing w:after="160"/>
+        <w:spacing w:after="120"/>
       </w:pPr>
       <w:r>
         <w:rPr>
@@ -593,19 +847,19 @@
           <w:color w:val="1C1C1C"/>
           <w:sz w:val="22"/>
         </w:rPr>
-        <w:t xml:space="preserve">Step 2: Write page metadata  </w:t>
+        <w:t xml:space="preserve">Step 2: Metadata written  </w:t>
       </w:r>
       <w:r>
         <w:rPr>
           <w:color w:val="666666"/>
           <w:sz w:val="22"/>
         </w:rPr>
-        <w:t>Set a targeted title ("Estate Sale FAQs — Reeves Estates, Houston"), a descriptive meta description (~155 characters targeting informational queries), and a canonical URL pointing to /faq.</w:t>
+        <w:t>Title: "Estate Sale FAQs — Houston". Meta description targeting informational queries. Canonical URL and OpenGraph tags.</w:t>
       </w:r>
     </w:p>
     <w:p>
       <w:pPr>
-        <w:spacing w:after="160"/>
+        <w:spacing w:after="120"/>
       </w:pPr>
       <w:r>
         <w:rPr>
@@ -613,19 +867,19 @@
           <w:color w:val="1C1C1C"/>
           <w:sz w:val="22"/>
         </w:rPr>
-        <w:t xml:space="preserve">Step 3: Add an H1  </w:t>
+        <w:t xml:space="preserve">Step 3: H1 added  </w:t>
       </w:r>
       <w:r>
         <w:rPr>
           <w:color w:val="666666"/>
           <w:sz w:val="22"/>
         </w:rPr>
-        <w:t>Add a page-level H1 above the existing FAQ groups — something like "Your Estate Sale Questions, Answered" — styled in PP Hatton Medium to match the services and neighbourhood page headers.</w:t>
+        <w:t>"Your Estate Sale Questions, Answered" — PP Hatton Medium, charcoal header, matching services/neighbourhood page pattern.</w:t>
       </w:r>
     </w:p>
     <w:p>
       <w:pPr>
-        <w:spacing w:after="160"/>
+        <w:spacing w:after="120"/>
       </w:pPr>
       <w:r>
         <w:rPr>
@@ -633,19 +887,19 @@
           <w:color w:val="1C1C1C"/>
           <w:sz w:val="22"/>
         </w:rPr>
-        <w:t xml:space="preserve">Step 4: Expand FAQPage JSON-LD  </w:t>
+        <w:t xml:space="preserve">Step 4: FAQPage JSON-LD expanded  </w:t>
       </w:r>
       <w:r>
         <w:rPr>
           <w:color w:val="666666"/>
           <w:sz w:val="22"/>
         </w:rPr>
-        <w:t>Move the FAQPage schema from the homepage to /faq and expand it to cover all five FAQ groups (currently ~14 questions). Each question/answer pair should be represented in the schema.</w:t>
+        <w:t>All 14 questions across 5 groups. Homepage schema covered only 5.</w:t>
       </w:r>
     </w:p>
     <w:p>
       <w:pPr>
-        <w:spacing w:after="160"/>
+        <w:spacing w:after="120"/>
       </w:pPr>
       <w:r>
         <w:rPr>
@@ -653,19 +907,19 @@
           <w:color w:val="1C1C1C"/>
           <w:sz w:val="22"/>
         </w:rPr>
-        <w:t xml:space="preserve">Step 5: Update the sitemap  </w:t>
+        <w:t xml:space="preserve">Step 5: Sitemap updated  </w:t>
       </w:r>
       <w:r>
         <w:rPr>
           <w:color w:val="666666"/>
           <w:sz w:val="22"/>
         </w:rPr>
-        <w:t>Add /faq to sitemap.ts with priority 0.8. Remove the /#faq anchor entry, which Google does not treat as an indexable URL.</w:t>
+        <w:t>/faq added at priority 0.8. /#faq anchor entry removed.</w:t>
       </w:r>
     </w:p>
     <w:p>
       <w:pPr>
-        <w:spacing w:after="160"/>
+        <w:spacing w:after="120"/>
       </w:pPr>
       <w:r>
         <w:rPr>
@@ -673,19 +927,19 @@
           <w:color w:val="1C1C1C"/>
           <w:sz w:val="22"/>
         </w:rPr>
-        <w:t xml:space="preserve">Step 6: Add internal links  </w:t>
+        <w:t xml:space="preserve">Step 6: Internal links added  </w:t>
       </w:r>
       <w:r>
         <w:rPr>
           <w:color w:val="666666"/>
           <w:sz w:val="22"/>
         </w:rPr>
-        <w:t>Link to /faq from the services page CTA section ("Have questions? See our FAQ") and from each neighbourhood page footer. Link back from /faq to /services and relevant neighbourhood pages within the answers where natural.</w:t>
+        <w:t>Link block to /services and all 8 neighbourhood pages at the foot of the FAQ content.</w:t>
       </w:r>
     </w:p>
     <w:p>
       <w:pPr>
-        <w:spacing w:after="160"/>
+        <w:spacing w:after="120"/>
       </w:pPr>
       <w:r>
         <w:rPr>
@@ -693,19 +947,19 @@
           <w:color w:val="1C1C1C"/>
           <w:sz w:val="22"/>
         </w:rPr>
-        <w:t xml:space="preserve">Step 7: Update nav  </w:t>
+        <w:t xml:space="preserve">Step 7: Nav updated  </w:t>
       </w:r>
       <w:r>
         <w:rPr>
           <w:color w:val="666666"/>
           <w:sz w:val="22"/>
         </w:rPr>
-        <w:t>Add an FAQ link to the desktop and mobile navigation, pointing to /faq rather than /#faq.</w:t>
+        <w:t>FAQs link now routes to /faq.</w:t>
       </w:r>
     </w:p>
     <w:p>
       <w:pPr>
-        <w:spacing w:after="160"/>
+        <w:spacing w:after="120"/>
       </w:pPr>
       <w:r>
         <w:rPr>
@@ -713,46 +967,46 @@
           <w:color w:val="1C1C1C"/>
           <w:sz w:val="22"/>
         </w:rPr>
-        <w:t xml:space="preserve">Step 8: Redirect /#faq  </w:t>
+        <w:t xml:space="preserve">Step 8: Data architecture fixed  </w:t>
       </w:r>
       <w:r>
         <w:rPr>
           <w:color w:val="666666"/>
           <w:sz w:val="22"/>
         </w:rPr>
-        <w:t>Consider a soft redirect or canonical hint so existing links pointing to /#faq consolidate authority to /faq.</w:t>
+        <w:t>faqGroups extracted to src/lib/faq-data.ts to resolve a Next.js server/client boundary build error.</w:t>
       </w:r>
     </w:p>
-    <w:p/>
     <w:p>
       <w:pPr>
-        <w:jc w:val="left"/>
+        <w:spacing w:before="200" w:after="40"/>
       </w:pPr>
       <w:r>
         <w:rPr>
           <w:b/>
           <w:color w:val="B8956A"/>
-          <w:sz w:val="28"/>
+          <w:sz w:val="26"/>
         </w:rPr>
-        <w:t>Beyond the FAQ page — Phase 3 horizon</w:t>
+        <w:t>Beyond /faq — Phase 3 horizon</w:t>
       </w:r>
     </w:p>
-    <w:p/>
     <w:p>
       <w:pPr>
-        <w:spacing w:after="120"/>
+        <w:spacing w:after="80"/>
       </w:pPr>
       <w:r>
         <w:rPr>
+          <w:i w:val="0"/>
           <w:color w:val="666666"/>
           <w:sz w:val="22"/>
         </w:rPr>
-        <w:t>Once /faq is live, the next meaningful SEO investment is a content hub: three to five long-form articles targeting high-intent informational queries that bring in families at the earliest stage of the estate process. Suggested topics:</w:t>
+        <w:t>Once /faq is live and indexed, the next meaningful SEO investment is a content hub: three to five long-form articles targeting high-intent informational queries. Suggested topics:</w:t>
       </w:r>
     </w:p>
     <w:p>
       <w:pPr>
         <w:pStyle w:val="ListBullet"/>
+        <w:spacing w:after="40"/>
       </w:pPr>
       <w:r>
         <w:rPr>
@@ -765,6 +1019,7 @@
     <w:p>
       <w:pPr>
         <w:pStyle w:val="ListBullet"/>
+        <w:spacing w:after="40"/>
       </w:pPr>
       <w:r>
         <w:rPr>
@@ -777,6 +1032,7 @@
     <w:p>
       <w:pPr>
         <w:pStyle w:val="ListBullet"/>
+        <w:spacing w:after="40"/>
       </w:pPr>
       <w:r>
         <w:rPr>
@@ -789,6 +1045,7 @@
     <w:p>
       <w:pPr>
         <w:pStyle w:val="ListBullet"/>
+        <w:spacing w:after="40"/>
       </w:pPr>
       <w:r>
         <w:rPr>
@@ -800,14 +1057,15 @@
     </w:p>
     <w:p>
       <w:pPr>
-        <w:spacing w:after="120"/>
+        <w:spacing w:after="80"/>
       </w:pPr>
       <w:r>
         <w:rPr>
+          <w:i w:val="0"/>
           <w:color w:val="666666"/>
           <w:sz w:val="22"/>
         </w:rPr>
-        <w:t>These articles would be housed at /resources or /guides and would link internally throughout the service and neighbourhood pages. This is a Phase 3 initiative — the right move after /faq is indexed and showing traction.</w:t>
+        <w:t>These would live at /resources or /guides and link internally throughout the service and neighbourhood pages. This is a Phase 3 initiative — the right move after /faq is indexed and showing traction.</w:t>
       </w:r>
     </w:p>
     <w:p/>

</xml_diff>